<commit_message>
docs: finalize the report and board evidence (ARP-15)
</commit_message>
<xml_diff>
--- a/reports/prob-period-1/SE-2423_Kartam_ProbPeriod1.docx
+++ b/reports/prob-period-1/SE-2423_Kartam_ProbPeriod1.docx
@@ -10,7 +10,7 @@
       <w:r>
         <w:drawing>
           <wp:inline xmlns:a="http://schemas.openxmlformats.org/drawingml/2006/main" xmlns:pic="http://schemas.openxmlformats.org/drawingml/2006/picture">
-            <wp:extent cx="2926080" cy="1278058"/>
+            <wp:extent cx="2926080" cy="1540042"/>
             <wp:docPr id="1" name="Picture 1"/>
             <wp:cNvGraphicFramePr>
               <a:graphicFrameLocks noChangeAspect="1"/>
@@ -19,11 +19,12 @@
               <a:graphicData uri="http://schemas.openxmlformats.org/drawingml/2006/picture">
                 <pic:pic>
                   <pic:nvPicPr>
-                    <pic:cNvPr id="0" name="image.png"/>
+                    <pic:cNvPr id="0" name="aitu-logo.png"/>
                     <pic:cNvPicPr/>
                   </pic:nvPicPr>
                   <pic:blipFill>
-                    <a:blip r:embed="rId11"/>
+                    <a:blip r:embed="rId95"/>
+                    <a:srcRect l="23438" t="25185" r="22135" b="23889"/>
                     <a:stretch>
                       <a:fillRect/>
                     </a:stretch>
@@ -31,7 +32,7 @@
                   <pic:spPr>
                     <a:xfrm>
                       <a:off x="0" y="0"/>
-                      <a:ext cx="2926080" cy="1278058"/>
+                      <a:ext cx="2926080" cy="1540042"/>
                     </a:xfrm>
                     <a:prstGeom prst="rect"/>
                   </pic:spPr>
@@ -469,7 +470,7 @@
       <w:pPr>
         <w:spacing w:before="360"/>
       </w:pPr>
-      <w:hyperlink r:id="rId95">
+      <w:hyperlink r:id="rId96">
         <w:r>
           <w:rPr>
             <w:color w:val="000000"/>
@@ -482,7 +483,7 @@
       </w:hyperlink>
     </w:p>
     <w:p>
-      <w:hyperlink r:id="rId96">
+      <w:hyperlink r:id="rId97">
         <w:r>
           <w:rPr>
             <w:color w:val="000000"/>
@@ -683,7 +684,7 @@
         </w:rPr>
         <w:t xml:space="preserve">The </w:t>
       </w:r>
-      <w:hyperlink r:id="rId97">
+      <w:hyperlink r:id="rId98">
         <w:r>
           <w:rPr>
             <w:color w:val="000000"/>
@@ -701,7 +702,7 @@
         </w:rPr>
         <w:t xml:space="preserve"> and </w:t>
       </w:r>
-      <w:hyperlink r:id="rId98">
+      <w:hyperlink r:id="rId99">
         <w:r>
           <w:rPr>
             <w:color w:val="000000"/>
@@ -808,7 +809,7 @@
         </w:rPr>
         <w:t xml:space="preserve">Vitaliy Golubenko conducted the five discussions. The records indicate permission to retain anonymised notes and cover face-to-face, voice and text conversations. We use paraphrases throughout, including S03, who did not permit direct quotation. Exact session dates and the prototype revision shown have not been confirmed, so no chronology or revision-specific completion rate is inferred from the notes. The </w:t>
       </w:r>
-      <w:hyperlink r:id="rId99">
+      <w:hyperlink r:id="rId100">
         <w:r>
           <w:rPr>
             <w:color w:val="000000"/>
@@ -1365,7 +1366,7 @@
         </w:rPr>
         <w:t xml:space="preserve">Seven submissions contained text for current planning, missing information and university support; eight contained text for visibility. Some entries were only punctuation or otherwise non-substantive. These counts indicate completion of a field, not the number of meaningful themes. We do not quote or infer preferences from text that was not substantively coded. The full closed-question counts are in the </w:t>
       </w:r>
-      <w:hyperlink r:id="rId100">
+      <w:hyperlink r:id="rId101">
         <w:r>
           <w:rPr>
             <w:color w:val="000000"/>
@@ -2690,7 +2691,7 @@
                     <pic:cNvPicPr/>
                   </pic:nvPicPr>
                   <pic:blipFill>
-                    <a:blip r:embed="rId101"/>
+                    <a:blip r:embed="rId102"/>
                     <a:stretch>
                       <a:fillRect/>
                     </a:stretch>
@@ -2720,7 +2721,7 @@
       </w:r>
     </w:p>
     <w:p>
-      <w:hyperlink r:id="rId102">
+      <w:hyperlink r:id="rId103">
         <w:r>
           <w:rPr>
             <w:color w:val="000000"/>
@@ -2738,7 +2739,7 @@
         </w:rPr>
         <w:t xml:space="preserve"> · </w:t>
       </w:r>
-      <w:hyperlink r:id="rId103">
+      <w:hyperlink r:id="rId104">
         <w:r>
           <w:rPr>
             <w:color w:val="000000"/>
@@ -2765,7 +2766,7 @@
         </w:rPr>
         <w:t xml:space="preserve">The revised result wording has passed the recorded </w:t>
       </w:r>
-      <w:hyperlink r:id="rId104">
+      <w:hyperlink r:id="rId105">
         <w:r>
           <w:rPr>
             <w:color w:val="000000"/>
@@ -2820,7 +2821,7 @@
         </w:rPr>
         <w:t xml:space="preserve">The </w:t>
       </w:r>
-      <w:hyperlink r:id="rId105">
+      <w:hyperlink r:id="rId106">
         <w:r>
           <w:rPr>
             <w:color w:val="000000"/>
@@ -2838,7 +2839,7 @@
         </w:rPr>
         <w:t xml:space="preserve">, </w:t>
       </w:r>
-      <w:hyperlink r:id="rId106">
+      <w:hyperlink r:id="rId107">
         <w:r>
           <w:rPr>
             <w:color w:val="000000"/>
@@ -2856,7 +2857,7 @@
         </w:rPr>
         <w:t xml:space="preserve">, </w:t>
       </w:r>
-      <w:hyperlink r:id="rId107">
+      <w:hyperlink r:id="rId108">
         <w:r>
           <w:rPr>
             <w:color w:val="000000"/>
@@ -2874,7 +2875,7 @@
         </w:rPr>
         <w:t xml:space="preserve"> and </w:t>
       </w:r>
-      <w:hyperlink r:id="rId108">
+      <w:hyperlink r:id="rId109">
         <w:r>
           <w:rPr>
             <w:color w:val="000000"/>
@@ -2892,7 +2893,7 @@
         </w:rPr>
         <w:t xml:space="preserve"> record the reading behind this synthesis. The </w:t>
       </w:r>
-      <w:hyperlink r:id="rId109">
+      <w:hyperlink r:id="rId110">
         <w:r>
           <w:rPr>
             <w:color w:val="000000"/>
@@ -2933,7 +2934,7 @@
                     <pic:cNvPicPr/>
                   </pic:nvPicPr>
                   <pic:blipFill>
-                    <a:blip r:embed="rId110"/>
+                    <a:blip r:embed="rId111"/>
                     <a:stretch>
                       <a:fillRect/>
                     </a:stretch>
@@ -8437,7 +8438,7 @@
         </w:rPr>
         <w:t xml:space="preserve">The four </w:t>
       </w:r>
-      <w:hyperlink r:id="rId111">
+      <w:hyperlink r:id="rId112">
         <w:r>
           <w:rPr>
             <w:color w:val="000000"/>
@@ -10628,7 +10629,7 @@
         </w:rPr>
         <w:t xml:space="preserve">The proposed application supports voluntary observations, personal history, conditional estimates and data requests. University systems and support services are outside the initial boundary. The system context distinguishes student operations from technical configuration. The </w:t>
       </w:r>
-      <w:hyperlink r:id="rId112">
+      <w:hyperlink r:id="rId113">
         <w:r>
           <w:rPr>
             <w:color w:val="000000"/>
@@ -10646,7 +10647,7 @@
         </w:rPr>
         <w:t xml:space="preserve"> and </w:t>
       </w:r>
-      <w:hyperlink r:id="rId111">
+      <w:hyperlink r:id="rId112">
         <w:r>
           <w:rPr>
             <w:color w:val="000000"/>
@@ -10717,7 +10718,7 @@
       </w:r>
     </w:p>
     <w:p>
-      <w:hyperlink r:id="rId113">
+      <w:hyperlink r:id="rId114">
         <w:r>
           <w:rPr>
             <w:color w:val="000000"/>
@@ -10805,7 +10806,7 @@
       </w:r>
     </w:p>
     <w:p>
-      <w:hyperlink r:id="rId114">
+      <w:hyperlink r:id="rId115">
         <w:r>
           <w:rPr>
             <w:color w:val="000000"/>
@@ -10902,7 +10903,7 @@
       </w:r>
     </w:p>
     <w:p>
-      <w:hyperlink r:id="rId115">
+      <w:hyperlink r:id="rId116">
         <w:r>
           <w:rPr>
             <w:color w:val="000000"/>
@@ -10937,7 +10938,7 @@
         </w:rPr>
         <w:t xml:space="preserve">The </w:t>
       </w:r>
-      <w:hyperlink r:id="rId116">
+      <w:hyperlink r:id="rId117">
         <w:r>
           <w:rPr>
             <w:color w:val="000000"/>
@@ -11679,7 +11680,7 @@
         </w:rPr>
         <w:t xml:space="preserve">The </w:t>
       </w:r>
-      <w:hyperlink r:id="rId96">
+      <w:hyperlink r:id="rId97">
         <w:r>
           <w:rPr>
             <w:color w:val="000000"/>
@@ -11697,7 +11698,7 @@
         </w:rPr>
         <w:t xml:space="preserve"> uses HTML, CSS and JavaScript. The </w:t>
       </w:r>
-      <w:hyperlink r:id="rId117">
+      <w:hyperlink r:id="rId118">
         <w:r>
           <w:rPr>
             <w:color w:val="000000"/>
@@ -11900,7 +11901,7 @@
                     <pic:cNvPicPr/>
                   </pic:nvPicPr>
                   <pic:blipFill>
-                    <a:blip r:embed="rId118"/>
+                    <a:blip r:embed="rId119"/>
                     <a:stretch>
                       <a:fillRect/>
                     </a:stretch>
@@ -12121,7 +12122,7 @@
         </w:rPr>
         <w:t xml:space="preserve">The </w:t>
       </w:r>
-      <w:hyperlink r:id="rId119">
+      <w:hyperlink r:id="rId120">
         <w:r>
           <w:rPr>
             <w:color w:val="000000"/>
@@ -13463,7 +13464,7 @@
         </w:rPr>
         <w:t xml:space="preserve">The </w:t>
       </w:r>
-      <w:hyperlink r:id="rId120">
+      <w:hyperlink r:id="rId121">
         <w:r>
           <w:rPr>
             <w:color w:val="000000"/>
@@ -14141,7 +14142,7 @@
         </w:rPr>
         <w:t xml:space="preserve"> contain fourteen tasks with owners, priorities, due dates, acceptance criteria and delivery links. The </w:t>
       </w:r>
-      <w:hyperlink r:id="rId121">
+      <w:hyperlink r:id="rId122">
         <w:r>
           <w:rPr>
             <w:color w:val="000000"/>
@@ -14375,7 +14376,7 @@
             <w:pPr>
               <w:spacing w:after="40" w:before="40" w:line="254" w:lineRule="auto"/>
             </w:pPr>
-            <w:hyperlink r:id="rId122">
+            <w:hyperlink r:id="rId123">
               <w:r>
                 <w:rPr>
                   <w:color w:val="000000"/>
@@ -14463,7 +14464,7 @@
             <w:pPr>
               <w:spacing w:after="40" w:before="40" w:line="254" w:lineRule="auto"/>
             </w:pPr>
-            <w:hyperlink r:id="rId123">
+            <w:hyperlink r:id="rId124">
               <w:r>
                 <w:rPr>
                   <w:color w:val="000000"/>
@@ -14551,7 +14552,7 @@
             <w:pPr>
               <w:spacing w:after="40" w:before="40" w:line="254" w:lineRule="auto"/>
             </w:pPr>
-            <w:hyperlink r:id="rId124">
+            <w:hyperlink r:id="rId125">
               <w:r>
                 <w:rPr>
                   <w:color w:val="000000"/>
@@ -14639,7 +14640,7 @@
             <w:pPr>
               <w:spacing w:after="40" w:before="40" w:line="254" w:lineRule="auto"/>
             </w:pPr>
-            <w:hyperlink r:id="rId125">
+            <w:hyperlink r:id="rId126">
               <w:r>
                 <w:rPr>
                   <w:color w:val="000000"/>
@@ -14727,7 +14728,7 @@
             <w:pPr>
               <w:spacing w:after="40" w:before="40" w:line="254" w:lineRule="auto"/>
             </w:pPr>
-            <w:hyperlink r:id="rId126">
+            <w:hyperlink r:id="rId127">
               <w:r>
                 <w:rPr>
                   <w:color w:val="000000"/>
@@ -14831,7 +14832,7 @@
         </w:rPr>
         <w:t xml:space="preserve">The submission target is 24 October 2026. First reconcile the user findings, peer review and supervisor-feedback status with the source documents. Then check the hosted prototype, repository and editable-diagram access; freeze the source revision; and produce matching report and task-evidence PDFs. The tag is </w:t>
       </w:r>
-      <w:hyperlink r:id="rId95">
+      <w:hyperlink r:id="rId96">
         <w:r>
           <w:rPr>
             <w:color w:val="000000"/>
@@ -15971,7 +15972,7 @@
         </w:rPr>
         <w:t xml:space="preserve">The </w:t>
       </w:r>
-      <w:hyperlink r:id="rId127">
+      <w:hyperlink r:id="rId128">
         <w:r>
           <w:rPr>
             <w:color w:val="000000"/>

</xml_diff>

<commit_message>
ARP-12 ARP-15: Finalize report and supervisor response
Publish the 36-page consolidated report and editable source, record the eight supervisor comments and three next-stage tasks, and align the management and design records. Use Astana time in the submission materials. Include the checked seven-page YouTrack evidence PDF.

Validation: all 11 report sections, linked contents, fonts, illustrations, relative document links and PDF upload sizes checked. The research and implementation follow-ups remain open.
</commit_message>
<xml_diff>
--- a/reports/prob-period-1/SE-2423_Kartam_ProbPeriod1.docx
+++ b/reports/prob-period-1/SE-2423_Kartam_ProbPeriod1.docx
@@ -718,7 +718,7 @@
           <w:b w:val="0"/>
           <w:i w:val="0"/>
         </w:rPr>
-        <w:t xml:space="preserve"> have not confirmed a suitable accessible longitudinal burnout dataset. Before forecasting is possible, we need repeated observations linked to the same students and an independently measured later outcome. The instrument, language, scoring and horizon are still open. If suitable data cannot be obtained, we will discuss a collection protocol or a narrower research question with the supervisor.</w:t>
+        <w:t xml:space="preserve"> have not confirmed a suitable accessible longitudinal burnout dataset. Before forecasting is possible, we need repeated observations linked to the same students and an independently measured later outcome. The instrument, language, scoring and horizon are still open. The supervisor requires an evidence-based feasibility decision and a narrower fallback if future prediction cannot be supported.</w:t>
       </w:r>
     </w:p>
     <w:p>
@@ -8812,7 +8812,7 @@
           <w:b w:val="0"/>
           <w:i w:val="0"/>
         </w:rPr>
-        <w:t>These requirements come from the proposal, literature and design comparisons. The user evidence in Section 2 informs their priorities; supervisor review remains pending. The student is the main actor. Private operations require an authenticated identity; an operator manages approved configurations without routine access to student answers.</w:t>
+        <w:t>These requirements come from the proposal, literature and design comparisons. User evidence in Section 2 and supervisor comments in Section 11 inform their refinement. The student is the main actor. Private operations require an authenticated identity; an operator manages approved configurations without routine access to student answers.</w:t>
       </w:r>
     </w:p>
     <w:p>
@@ -13580,7 +13580,7 @@
           <w:b w:val="0"/>
           <w:i w:val="0"/>
         </w:rPr>
-        <w:t>The repository contains research and design documents, the synthetic interaction prototype, evaluation procedures and management records. Published PRs 1 to 7 establish the earlier deliverables. The current submission incorporates the user-evidence synthesis; substantive peer review and supervisor decisions are recorded separately.</w:t>
+        <w:t>The repository contains research and design documents, the synthetic interaction prototype, evaluation procedures and management records. Published PRs 1 to 8 establish the earlier deliverables. The current submission incorporates user evidence and the supervisor response in Section 11; substantive peer review remains open.</w:t>
       </w:r>
     </w:p>
     <w:tbl>
@@ -13791,7 +13791,7 @@
                 <w:color w:val="000000"/>
                 <w:sz w:val="22"/>
               </w:rPr>
-              <w:t xml:space="preserve"> and </w:t>
+              <w:t xml:space="preserve">, </w:t>
             </w:r>
             <w:hyperlink r:id="rId88">
               <w:r>
@@ -13802,6 +13802,26 @@
                   <w:rFonts w:ascii="Times New Roman" w:hAnsi="Times New Roman"/>
                 </w:rPr>
                 <w:t>PR 7</w:t>
+              </w:r>
+            </w:hyperlink>
+            <w:r>
+              <w:rPr>
+                <w:b w:val="0"/>
+                <w:i w:val="0"/>
+                <w:color w:val="000000"/>
+                <w:sz w:val="22"/>
+              </w:rPr>
+              <w:t xml:space="preserve"> and </w:t>
+            </w:r>
+            <w:hyperlink r:id="rId122">
+              <w:r>
+                <w:rPr>
+                  <w:color w:val="000000"/>
+                  <w:u w:val="single"/>
+                  <w:i/>
+                  <w:rFonts w:ascii="Times New Roman" w:hAnsi="Times New Roman"/>
+                </w:rPr>
+                <w:t>PR 8</w:t>
               </w:r>
             </w:hyperlink>
             <w:r>
@@ -14140,9 +14160,9 @@
           <w:b w:val="0"/>
           <w:i w:val="0"/>
         </w:rPr>
-        <w:t xml:space="preserve"> contain fourteen tasks with owners, priorities, due dates, acceptance criteria and delivery links. The </w:t>
+        <w:t xml:space="preserve"> track fourteen first-period tasks with owners, priorities, due dates, acceptance criteria and delivery links. Three next-stage tasks add feasibility (ARP-16, Aruzhan, Critical), the application slice (ARP-17, Vitaliy, Major) and the data audit/protocol (ARP-18, Aruzhan, Major). All three are To do without due dates because the next review date is unspecified. The </w:t>
       </w:r>
-      <w:hyperlink r:id="rId122">
+      <w:hyperlink r:id="rId123">
         <w:r>
           <w:rPr>
             <w:color w:val="000000"/>
@@ -14158,7 +14178,7 @@
           <w:b w:val="0"/>
           <w:i w:val="0"/>
         </w:rPr>
-        <w:t xml:space="preserve"> retains the detailed mappings; the table below distinguishes published material from remaining acceptance evidence.</w:t>
+        <w:t xml:space="preserve"> maps the seventeen tasks; the table below summarises first-period evidence.</w:t>
       </w:r>
     </w:p>
     <w:tbl>
@@ -14376,7 +14396,7 @@
             <w:pPr>
               <w:spacing w:after="40" w:before="40" w:line="254" w:lineRule="auto"/>
             </w:pPr>
-            <w:hyperlink r:id="rId123">
+            <w:hyperlink r:id="rId124">
               <w:r>
                 <w:rPr>
                   <w:color w:val="000000"/>
@@ -14464,7 +14484,7 @@
             <w:pPr>
               <w:spacing w:after="40" w:before="40" w:line="254" w:lineRule="auto"/>
             </w:pPr>
-            <w:hyperlink r:id="rId124">
+            <w:hyperlink r:id="rId125">
               <w:r>
                 <w:rPr>
                   <w:color w:val="000000"/>
@@ -14527,7 +14547,7 @@
                 <w:color w:val="000000"/>
                 <w:sz w:val="22"/>
               </w:rPr>
-              <w:t>Substantive comments have not yet been received; Section 11 identifies the decisions sought.</w:t>
+              <w:t>Eight comments were supplied on 24 October. Section 11 records responses and open next-stage actions.</w:t>
             </w:r>
           </w:p>
         </w:tc>
@@ -14552,7 +14572,7 @@
             <w:pPr>
               <w:spacing w:after="40" w:before="40" w:line="254" w:lineRule="auto"/>
             </w:pPr>
-            <w:hyperlink r:id="rId125">
+            <w:hyperlink r:id="rId126">
               <w:r>
                 <w:rPr>
                   <w:color w:val="000000"/>
@@ -14640,7 +14660,7 @@
             <w:pPr>
               <w:spacing w:after="40" w:before="40" w:line="254" w:lineRule="auto"/>
             </w:pPr>
-            <w:hyperlink r:id="rId126">
+            <w:hyperlink r:id="rId127">
               <w:r>
                 <w:rPr>
                   <w:color w:val="000000"/>
@@ -14703,7 +14723,7 @@
                 <w:color w:val="000000"/>
                 <w:sz w:val="22"/>
               </w:rPr>
-              <w:t>Hosted prototype and source links are provided; final viewer-access checks are part of the submission gate.</w:t>
+              <w:t>Public prototype and repository access checks are recorded. Live YouTrack access requires an account; its evidence PDF is provided.</w:t>
             </w:r>
           </w:p>
         </w:tc>
@@ -14728,7 +14748,7 @@
             <w:pPr>
               <w:spacing w:after="40" w:before="40" w:line="254" w:lineRule="auto"/>
             </w:pPr>
-            <w:hyperlink r:id="rId127">
+            <w:hyperlink r:id="rId128">
               <w:r>
                 <w:rPr>
                   <w:color w:val="000000"/>
@@ -14830,7 +14850,7 @@
           <w:b w:val="0"/>
           <w:i w:val="0"/>
         </w:rPr>
-        <w:t xml:space="preserve">The submission target is 24 October 2026. First reconcile the user findings, peer review and supervisor-feedback status with the source documents. Then check the hosted prototype, repository and editable-diagram access; freeze the source revision; and produce matching report and task-evidence PDFs. The tag is </w:t>
+        <w:t xml:space="preserve">The submission deadline is 24 October 2026, 18:00 Astana time. First reconcile the user findings, peer review and supervisor-feedback status with the source documents. Then check the hosted prototype, repository and editable-diagram access; freeze the source revision; and produce matching report and task-evidence PDFs. The tag is </w:t>
       </w:r>
       <w:hyperlink r:id="rId96">
         <w:r>
@@ -15325,6 +15345,7 @@
     <w:p>
       <w:pPr>
         <w:pStyle w:val="Heading2"/>
+        <w:pageBreakBefore/>
       </w:pPr>
       <w:r>
         <w:t>10.4 Principal risks</w:t>
@@ -15550,7 +15571,7 @@
                 <w:color w:val="000000"/>
                 <w:sz w:val="22"/>
               </w:rPr>
-              <w:t>Supervisor feedback or peer review is incomplete.</w:t>
+              <w:t>Supervisor actions or peer review remain incomplete.</w:t>
             </w:r>
           </w:p>
         </w:tc>
@@ -15604,7 +15625,7 @@
                 <w:color w:val="000000"/>
                 <w:sz w:val="22"/>
               </w:rPr>
-              <w:t>Aruzhan and Vitaliy. Record actual comments and decisions; keep unresolved approval and changes visible.</w:t>
+              <w:t>Aruzhan and Vitaliy. Address the recorded comments and retain actual review evidence; keep outstanding actions visible.</w:t>
             </w:r>
           </w:p>
         </w:tc>
@@ -15972,7 +15993,7 @@
         </w:rPr>
         <w:t xml:space="preserve">The </w:t>
       </w:r>
-      <w:hyperlink r:id="rId128">
+      <w:hyperlink r:id="rId129">
         <w:r>
           <w:rPr>
             <w:color w:val="000000"/>
@@ -16007,7 +16028,7 @@
         <w:pStyle w:val="Heading2"/>
       </w:pPr>
       <w:r>
-        <w:t>11.1 Current feedback status</w:t>
+        <w:t>11.1 Feedback received</w:t>
       </w:r>
     </w:p>
     <w:p>
@@ -16016,7 +16037,52 @@
           <w:b w:val="0"/>
           <w:i w:val="0"/>
         </w:rPr>
-        <w:t>Supervisor feedback remains pending. The following decisions are requested before the next implementation and research stage.</w:t>
+        <w:t>Akbota Rakym's feedback was supplied through the team representative on 24 October 2026. The writing date and exact reviewed revision are unconfirmed; the supplied page references concern that earlier report. The supervisor described a strong research and design submission, particularly the literature, testable requirements and distinction between workload, burnout measurement and demonstration data. The main concern is prediction feasibility.</w:t>
+      </w:r>
+    </w:p>
+    <w:p>
+      <w:r>
+        <w:rPr>
+          <w:b w:val="0"/>
+          <w:i w:val="0"/>
+        </w:rPr>
+        <w:t xml:space="preserve">The supervisor did not independently verify repository activity, prototype execution, interviews or experiments. This response records current evidence and planned changes; it does not claim approval of implementation or results. The </w:t>
+      </w:r>
+      <w:hyperlink r:id="rId130">
+        <w:r>
+          <w:rPr>
+            <w:color w:val="000000"/>
+            <w:u w:val="single"/>
+            <w:i/>
+            <w:rFonts w:ascii="Times New Roman" w:hAnsi="Times New Roman"/>
+          </w:rPr>
+          <w:t>full response register</w:t>
+        </w:r>
+      </w:hyperlink>
+      <w:r>
+        <w:rPr>
+          <w:b w:val="0"/>
+          <w:i w:val="0"/>
+        </w:rPr>
+        <w:t xml:space="preserve"> tracks the actions through </w:t>
+      </w:r>
+      <w:hyperlink r:id="rId125">
+        <w:r>
+          <w:rPr>
+            <w:color w:val="000000"/>
+            <w:u w:val="single"/>
+            <w:i/>
+            <w:rFonts w:ascii="Times New Roman" w:hAnsi="Times New Roman"/>
+          </w:rPr>
+          <w:t>ARP-12</w:t>
+        </w:r>
+      </w:hyperlink>
+      <w:r>
+        <w:rPr>
+          <w:b w:val="0"/>
+          <w:i w:val="0"/>
+        </w:rPr>
+        <w:t>.</w:t>
       </w:r>
     </w:p>
     <w:p>
@@ -16024,7 +16090,16 @@
         <w:pStyle w:val="Heading2"/>
       </w:pPr>
       <w:r>
-        <w:t>11.2 Decisions requested</w:t>
+        <w:t>11.2 Comments and responses</w:t>
+      </w:r>
+    </w:p>
+    <w:p>
+      <w:r>
+        <w:rPr>
+          <w:b w:val="0"/>
+          <w:i w:val="0"/>
+        </w:rPr>
+        <w:t>Priorities follow the supplied feedback. All remaining actions below are open.</w:t>
       </w:r>
     </w:p>
     <w:tbl>
@@ -16043,9 +16118,9 @@
         </w:tblBorders>
       </w:tblPr>
       <w:tblGrid>
-        <w:gridCol w:w="2304"/>
+        <w:gridCol w:w="1901"/>
         <w:gridCol w:w="3384"/>
-        <w:gridCol w:w="3917"/>
+        <w:gridCol w:w="4320"/>
       </w:tblGrid>
       <w:tr>
         <w:trPr>
@@ -16054,7 +16129,7 @@
         </w:trPr>
         <w:tc>
           <w:tcPr>
-            <w:tcW w:type="dxa" w:w="2304"/>
+            <w:tcW w:type="dxa" w:w="1901"/>
             <w:vAlign w:val="center"/>
             <w:tcMar>
               <w:top w:w="75" w:type="dxa"/>
@@ -16075,7 +16150,7 @@
                 <w:color w:val="000000"/>
                 <w:sz w:val="22"/>
               </w:rPr>
-              <w:t>Topic</w:t>
+              <w:t>Comment and priority</w:t>
             </w:r>
           </w:p>
         </w:tc>
@@ -16102,13 +16177,13 @@
                 <w:color w:val="000000"/>
                 <w:sz w:val="22"/>
               </w:rPr>
-              <w:t>Decision sought</w:t>
+              <w:t>Current evidence</w:t>
             </w:r>
           </w:p>
         </w:tc>
         <w:tc>
           <w:tcPr>
-            <w:tcW w:type="dxa" w:w="3917"/>
+            <w:tcW w:type="dxa" w:w="4320"/>
             <w:vAlign w:val="center"/>
             <w:tcMar>
               <w:top w:w="75" w:type="dxa"/>
@@ -16129,7 +16204,7 @@
                 <w:color w:val="000000"/>
                 <w:sz w:val="22"/>
               </w:rPr>
-              <w:t>Follow-up</w:t>
+              <w:t>Response before the next review</w:t>
             </w:r>
           </w:p>
         </w:tc>
@@ -16140,7 +16215,7 @@
         </w:trPr>
         <w:tc>
           <w:tcPr>
-            <w:tcW w:type="dxa" w:w="2304"/>
+            <w:tcW w:type="dxa" w:w="1901"/>
             <w:vAlign w:val="center"/>
             <w:tcMar>
               <w:top w:w="75" w:type="dxa"/>
@@ -16156,12 +16231,12 @@
             </w:pPr>
             <w:r>
               <w:rPr>
-                <w:b w:val="0"/>
+                <w:b/>
                 <w:i w:val="0"/>
                 <w:color w:val="000000"/>
                 <w:sz w:val="22"/>
               </w:rPr>
-              <w:t>Student need and scope</w:t>
+              <w:t>1. Prediction feasibility and scope: Critical</w:t>
             </w:r>
           </w:p>
         </w:tc>
@@ -16188,13 +16263,13 @@
                 <w:color w:val="000000"/>
                 <w:sz w:val="22"/>
               </w:rPr>
-              <w:t>Does the initial workload-recording and personal-history workflow address a suitable diploma problem, given the limited user evidence?</w:t>
+              <w:t>The dataset audit has not established a suitable longitudinal burnout dataset. Outcome, instrument and horizon remain unresolved.</w:t>
             </w:r>
           </w:p>
         </w:tc>
         <w:tc>
           <w:tcPr>
-            <w:tcW w:type="dxa" w:w="3917"/>
+            <w:tcW w:type="dxa" w:w="4320"/>
             <w:vAlign w:val="center"/>
             <w:tcMar>
               <w:top w:w="75" w:type="dxa"/>
@@ -16215,7 +16290,7 @@
                 <w:color w:val="000000"/>
                 <w:sz w:val="22"/>
               </w:rPr>
-              <w:t>Confirm priorities and record any requirement changes.</w:t>
+              <w:t>Choose overload or burnout, instrument/version, language, scoring and horizon. Verify legal/ethical access and repeated measurements. Record a supported feasibility decision and fallback scope.</w:t>
             </w:r>
           </w:p>
         </w:tc>
@@ -16226,7 +16301,7 @@
         </w:trPr>
         <w:tc>
           <w:tcPr>
-            <w:tcW w:type="dxa" w:w="2304"/>
+            <w:tcW w:type="dxa" w:w="1901"/>
             <w:vAlign w:val="center"/>
             <w:tcMar>
               <w:top w:w="75" w:type="dxa"/>
@@ -16242,12 +16317,12 @@
             </w:pPr>
             <w:r>
               <w:rPr>
-                <w:b w:val="0"/>
+                <w:b/>
                 <w:i w:val="0"/>
                 <w:color w:val="000000"/>
                 <w:sz w:val="22"/>
               </w:rPr>
-              <w:t>Measurement and data</w:t>
+              <w:t>2. User research: High</w:t>
             </w:r>
           </w:p>
         </w:tc>
@@ -16274,13 +16349,13 @@
                 <w:color w:val="000000"/>
                 <w:sz w:val="22"/>
               </w:rPr>
-              <w:t>Which primary construct, instrument/language and permitted longitudinal data route are feasible?</w:t>
+              <w:t>The current Section 2 contains five interview records and nine questionnaire submissions. Session metadata and some interpretations remain open.</w:t>
             </w:r>
           </w:p>
         </w:tc>
         <w:tc>
           <w:tcPr>
-            <w:tcW w:type="dxa" w:w="3917"/>
+            <w:tcW w:type="dxa" w:w="4320"/>
             <w:vAlign w:val="center"/>
             <w:tcMar>
               <w:top w:w="75" w:type="dxa"/>
@@ -16301,7 +16376,7 @@
                 <w:color w:val="000000"/>
                 <w:sz w:val="22"/>
               </w:rPr>
-              <w:t>Complete the measurement/data audit before selecting a forecasting endpoint.</w:t>
+              <w:t>Confirm available metadata, conduct follow-up walkthroughs and link findings to requirement changes or reasons for no change. Existing notes are not five successful standardised tests.</w:t>
             </w:r>
           </w:p>
         </w:tc>
@@ -16312,7 +16387,7 @@
         </w:trPr>
         <w:tc>
           <w:tcPr>
-            <w:tcW w:type="dxa" w:w="2304"/>
+            <w:tcW w:type="dxa" w:w="1901"/>
             <w:vAlign w:val="center"/>
             <w:tcMar>
               <w:top w:w="75" w:type="dxa"/>
@@ -16328,12 +16403,12 @@
             </w:pPr>
             <w:r>
               <w:rPr>
-                <w:b w:val="0"/>
+                <w:b/>
                 <w:i w:val="0"/>
                 <w:color w:val="000000"/>
                 <w:sz w:val="22"/>
               </w:rPr>
-              <w:t>Evaluation</w:t>
+              <w:t>3. Research and evaluation: High</w:t>
             </w:r>
           </w:p>
         </w:tc>
@@ -16360,13 +16435,13 @@
                 <w:color w:val="000000"/>
                 <w:sz w:val="22"/>
               </w:rPr>
-              <w:t>Are the proposed baselines, student/time separation and acceptance gates appropriate?</w:t>
+              <w:t>Section 9 separates assessment from forecasting and proposes conditional splits, metrics and leakage controls. No record-level audit or model result is reported.</w:t>
             </w:r>
           </w:p>
         </w:tc>
         <w:tc>
           <w:tcPr>
-            <w:tcW w:type="dxa" w:w="3917"/>
+            <w:tcW w:type="dxa" w:w="4320"/>
             <w:vAlign w:val="center"/>
             <w:tcMar>
               <w:top w:w="75" w:type="dxa"/>
@@ -16387,7 +16462,7 @@
                 <w:color w:val="000000"/>
                 <w:sz w:val="22"/>
               </w:rPr>
-              <w:t>Freeze the agreed protocol before final-test access.</w:t>
+              <w:t>After defining the outcome and data, freeze population, temporal split, baselines, primary metric and practical criteria. Run a reproducible audit of permitted records, availability times and label independence.</w:t>
             </w:r>
           </w:p>
         </w:tc>
@@ -16398,7 +16473,7 @@
         </w:trPr>
         <w:tc>
           <w:tcPr>
-            <w:tcW w:type="dxa" w:w="2304"/>
+            <w:tcW w:type="dxa" w:w="1901"/>
             <w:vAlign w:val="center"/>
             <w:tcMar>
               <w:top w:w="75" w:type="dxa"/>
@@ -16414,12 +16489,12 @@
             </w:pPr>
             <w:r>
               <w:rPr>
-                <w:b w:val="0"/>
+                <w:b/>
                 <w:i w:val="0"/>
                 <w:color w:val="000000"/>
                 <w:sz w:val="22"/>
               </w:rPr>
-              <w:t>Implementation</w:t>
+              <w:t>4. Implementation evidence: High</w:t>
             </w:r>
           </w:p>
         </w:tc>
@@ -16446,13 +16521,13 @@
                 <w:color w:val="000000"/>
                 <w:sz w:val="22"/>
               </w:rPr>
-              <w:t>Which user, data-control and access requirements should guide the first backend iteration?</w:t>
+              <w:t>The prototype remains synthetic and memory-only. React, FastAPI, PostgreSQL, authentication and persistence are proposed.</w:t>
             </w:r>
           </w:p>
         </w:tc>
         <w:tc>
           <w:tcPr>
-            <w:tcW w:type="dxa" w:w="3917"/>
+            <w:tcW w:type="dxa" w:w="4320"/>
             <w:vAlign w:val="center"/>
             <w:tcMar>
               <w:top w:w="75" w:type="dxa"/>
@@ -16473,7 +16548,351 @@
                 <w:color w:val="000000"/>
                 <w:sz w:val="22"/>
               </w:rPr>
-              <w:t>Update the backlog and architecture decisions with the review outcome.</w:t>
+              <w:t>Build and demonstrate authenticated input, server validation, owned storage and history. Retain positive, ownership-denial and failure/retry test evidence for REQ-V02, V03, V04 and V12.</w:t>
+            </w:r>
+          </w:p>
+        </w:tc>
+      </w:tr>
+      <w:tr>
+        <w:trPr>
+          <w:cantSplit/>
+        </w:trPr>
+        <w:tc>
+          <w:tcPr>
+            <w:tcW w:type="dxa" w:w="1901"/>
+            <w:vAlign w:val="center"/>
+            <w:tcMar>
+              <w:top w:w="75" w:type="dxa"/>
+              <w:bottom w:w="75" w:type="dxa"/>
+              <w:left w:w="85" w:type="dxa"/>
+              <w:right w:w="85" w:type="dxa"/>
+            </w:tcMar>
+            <w:shd w:fill="FFFFFF"/>
+          </w:tcPr>
+          <w:p>
+            <w:pPr>
+              <w:spacing w:after="40" w:before="40" w:line="254" w:lineRule="auto"/>
+            </w:pPr>
+            <w:r>
+              <w:rPr>
+                <w:b/>
+                <w:i w:val="0"/>
+                <w:color w:val="000000"/>
+                <w:sz w:val="22"/>
+              </w:rPr>
+              <w:t>5. Privacy and responsible use: High</w:t>
+            </w:r>
+          </w:p>
+        </w:tc>
+        <w:tc>
+          <w:tcPr>
+            <w:tcW w:type="dxa" w:w="3384"/>
+            <w:vAlign w:val="center"/>
+            <w:tcMar>
+              <w:top w:w="75" w:type="dxa"/>
+              <w:bottom w:w="75" w:type="dxa"/>
+              <w:left w:w="85" w:type="dxa"/>
+              <w:right w:w="85" w:type="dxa"/>
+            </w:tcMar>
+            <w:shd w:fill="FFFFFF"/>
+          </w:tcPr>
+          <w:p>
+            <w:pPr>
+              <w:spacing w:after="40" w:before="40" w:line="254" w:lineRule="auto"/>
+            </w:pPr>
+            <w:r>
+              <w:rPr>
+                <w:b w:val="0"/>
+                <w:i w:val="0"/>
+                <w:color w:val="000000"/>
+                <w:sz w:val="22"/>
+              </w:rPr>
+              <w:t>FR-001/006 and NFR-001/002/006 define notice, ownership and lifecycle conditions. Exploratory interviews do not establish permission for a data pilot.</w:t>
+            </w:r>
+          </w:p>
+        </w:tc>
+        <w:tc>
+          <w:tcPr>
+            <w:tcW w:type="dxa" w:w="4320"/>
+            <w:vAlign w:val="center"/>
+            <w:tcMar>
+              <w:top w:w="75" w:type="dxa"/>
+              <w:bottom w:w="75" w:type="dxa"/>
+              <w:left w:w="85" w:type="dxa"/>
+              <w:right w:w="85" w:type="dxa"/>
+            </w:tcMar>
+            <w:shd w:fill="FFFFFF"/>
+          </w:tcPr>
+          <w:p>
+            <w:pPr>
+              <w:spacing w:after="40" w:before="40" w:line="254" w:lineRule="auto"/>
+            </w:pPr>
+            <w:r>
+              <w:rPr>
+                <w:b w:val="0"/>
+                <w:i w:val="0"/>
+                <w:color w:val="000000"/>
+                <w:sz w:val="22"/>
+              </w:rPr>
+              <w:t>Before collection, document consent, minimisation, retention, deletion, access and institutional permissions. Keep non-diagnostic wording, no unsupported risk scores and no automatic staff disclosure.</w:t>
+            </w:r>
+          </w:p>
+        </w:tc>
+      </w:tr>
+      <w:tr>
+        <w:trPr>
+          <w:cantSplit/>
+        </w:trPr>
+        <w:tc>
+          <w:tcPr>
+            <w:tcW w:type="dxa" w:w="1901"/>
+            <w:vAlign w:val="center"/>
+            <w:tcMar>
+              <w:top w:w="75" w:type="dxa"/>
+              <w:bottom w:w="75" w:type="dxa"/>
+              <w:left w:w="85" w:type="dxa"/>
+              <w:right w:w="85" w:type="dxa"/>
+            </w:tcMar>
+            <w:shd w:fill="FFFFFF"/>
+          </w:tcPr>
+          <w:p>
+            <w:pPr>
+              <w:spacing w:after="40" w:before="40" w:line="254" w:lineRule="auto"/>
+            </w:pPr>
+            <w:r>
+              <w:rPr>
+                <w:b/>
+                <w:i w:val="0"/>
+                <w:color w:val="000000"/>
+                <w:sz w:val="22"/>
+              </w:rPr>
+              <w:t>6. Architecture and API: Medium</w:t>
+            </w:r>
+          </w:p>
+        </w:tc>
+        <w:tc>
+          <w:tcPr>
+            <w:tcW w:type="dxa" w:w="3384"/>
+            <w:vAlign w:val="center"/>
+            <w:tcMar>
+              <w:top w:w="75" w:type="dxa"/>
+              <w:bottom w:w="75" w:type="dxa"/>
+              <w:left w:w="85" w:type="dxa"/>
+              <w:right w:w="85" w:type="dxa"/>
+            </w:tcMar>
+            <w:shd w:fill="FFFFFF"/>
+          </w:tcPr>
+          <w:p>
+            <w:pPr>
+              <w:spacing w:after="40" w:before="40" w:line="254" w:lineRule="auto"/>
+            </w:pPr>
+            <w:r>
+              <w:rPr>
+                <w:b w:val="0"/>
+                <w:i w:val="0"/>
+                <w:color w:val="000000"/>
+                <w:sz w:val="22"/>
+              </w:rPr>
+              <w:t>Section 7 describes routes and boundaries; an executable OpenAPI contract is not delivered.</w:t>
+            </w:r>
+          </w:p>
+        </w:tc>
+        <w:tc>
+          <w:tcPr>
+            <w:tcW w:type="dxa" w:w="4320"/>
+            <w:vAlign w:val="center"/>
+            <w:tcMar>
+              <w:top w:w="75" w:type="dxa"/>
+              <w:bottom w:w="75" w:type="dxa"/>
+              <w:left w:w="85" w:type="dxa"/>
+              <w:right w:w="85" w:type="dxa"/>
+            </w:tcMar>
+            <w:shd w:fill="FFFFFF"/>
+          </w:tcPr>
+          <w:p>
+            <w:pPr>
+              <w:spacing w:after="40" w:before="40" w:line="254" w:lineRule="auto"/>
+            </w:pPr>
+            <w:r>
+              <w:rPr>
+                <w:b w:val="0"/>
+                <w:i w:val="0"/>
+                <w:color w:val="000000"/>
+                <w:sz w:val="22"/>
+              </w:rPr>
+              <w:t>Validate a contract covering authentication, errors, idempotency and lifecycle. Check model availability before model-specific sufficiency; distinguish execution failures and return no score for unavailable/insufficient states.</w:t>
+            </w:r>
+          </w:p>
+        </w:tc>
+      </w:tr>
+      <w:tr>
+        <w:trPr>
+          <w:cantSplit/>
+        </w:trPr>
+        <w:tc>
+          <w:tcPr>
+            <w:tcW w:type="dxa" w:w="1901"/>
+            <w:vAlign w:val="center"/>
+            <w:tcMar>
+              <w:top w:w="75" w:type="dxa"/>
+              <w:bottom w:w="75" w:type="dxa"/>
+              <w:left w:w="85" w:type="dxa"/>
+              <w:right w:w="85" w:type="dxa"/>
+            </w:tcMar>
+            <w:shd w:fill="FFFFFF"/>
+          </w:tcPr>
+          <w:p>
+            <w:pPr>
+              <w:spacing w:after="40" w:before="40" w:line="254" w:lineRule="auto"/>
+            </w:pPr>
+            <w:r>
+              <w:rPr>
+                <w:b/>
+                <w:i w:val="0"/>
+                <w:color w:val="000000"/>
+                <w:sz w:val="22"/>
+              </w:rPr>
+              <w:t>7. UX validation: Medium</w:t>
+            </w:r>
+          </w:p>
+        </w:tc>
+        <w:tc>
+          <w:tcPr>
+            <w:tcW w:type="dxa" w:w="3384"/>
+            <w:vAlign w:val="center"/>
+            <w:tcMar>
+              <w:top w:w="75" w:type="dxa"/>
+              <w:bottom w:w="75" w:type="dxa"/>
+              <w:left w:w="85" w:type="dxa"/>
+              <w:right w:w="85" w:type="dxa"/>
+            </w:tcMar>
+            <w:shd w:fill="FFFFFF"/>
+          </w:tcPr>
+          <w:p>
+            <w:pPr>
+              <w:spacing w:after="40" w:before="40" w:line="254" w:lineRule="auto"/>
+            </w:pPr>
+            <w:r>
+              <w:rPr>
+                <w:b w:val="0"/>
+                <w:i w:val="0"/>
+                <w:color w:val="000000"/>
+                <w:sz w:val="22"/>
+              </w:rPr>
+              <w:t>Result wording was revised after recorded ambiguity, then browser-checked. Participant understanding was not retested; a 500-pixel check does not meet the 360-pixel target.</w:t>
+            </w:r>
+          </w:p>
+        </w:tc>
+        <w:tc>
+          <w:tcPr>
+            <w:tcW w:type="dxa" w:w="4320"/>
+            <w:vAlign w:val="center"/>
+            <w:tcMar>
+              <w:top w:w="75" w:type="dxa"/>
+              <w:bottom w:w="75" w:type="dxa"/>
+              <w:left w:w="85" w:type="dxa"/>
+              <w:right w:w="85" w:type="dxa"/>
+            </w:tcMar>
+            <w:shd w:fill="FFFFFF"/>
+          </w:tcPr>
+          <w:p>
+            <w:pPr>
+              <w:spacing w:after="40" w:before="40" w:line="254" w:lineRule="auto"/>
+            </w:pPr>
+            <w:r>
+              <w:rPr>
+                <w:b w:val="0"/>
+                <w:i w:val="0"/>
+                <w:color w:val="000000"/>
+                <w:sz w:val="22"/>
+              </w:rPr>
+              <w:t>Observe missing versus zero, unavailable versus low risk, and pending versus completed. Record assistance, explanations and shown revision; verify corrections and NFR-004/REQ-V10.</w:t>
+            </w:r>
+          </w:p>
+        </w:tc>
+      </w:tr>
+      <w:tr>
+        <w:trPr>
+          <w:cantSplit/>
+        </w:trPr>
+        <w:tc>
+          <w:tcPr>
+            <w:tcW w:type="dxa" w:w="1901"/>
+            <w:vAlign w:val="center"/>
+            <w:tcMar>
+              <w:top w:w="75" w:type="dxa"/>
+              <w:bottom w:w="75" w:type="dxa"/>
+              <w:left w:w="85" w:type="dxa"/>
+              <w:right w:w="85" w:type="dxa"/>
+            </w:tcMar>
+            <w:shd w:fill="FFFFFF"/>
+          </w:tcPr>
+          <w:p>
+            <w:pPr>
+              <w:spacing w:after="40" w:before="40" w:line="254" w:lineRule="auto"/>
+            </w:pPr>
+            <w:r>
+              <w:rPr>
+                <w:b/>
+                <w:i w:val="0"/>
+                <w:color w:val="000000"/>
+                <w:sz w:val="22"/>
+              </w:rPr>
+              <w:t>8. GitHub, YouTrack and traceability: Medium</w:t>
+            </w:r>
+          </w:p>
+        </w:tc>
+        <w:tc>
+          <w:tcPr>
+            <w:tcW w:type="dxa" w:w="3384"/>
+            <w:vAlign w:val="center"/>
+            <w:tcMar>
+              <w:top w:w="75" w:type="dxa"/>
+              <w:bottom w:w="75" w:type="dxa"/>
+              <w:left w:w="85" w:type="dxa"/>
+              <w:right w:w="85" w:type="dxa"/>
+            </w:tcMar>
+            <w:shd w:fill="FFFFFF"/>
+          </w:tcPr>
+          <w:p>
+            <w:pPr>
+              <w:spacing w:after="40" w:before="40" w:line="254" w:lineRule="auto"/>
+            </w:pPr>
+            <w:r>
+              <w:rPr>
+                <w:b w:val="0"/>
+                <w:i w:val="0"/>
+                <w:color w:val="000000"/>
+                <w:sz w:val="22"/>
+              </w:rPr>
+              <w:t>The task register links owners and delivery evidence. Public-access checks and a YouTrack evidence PDF exist; substantive peer review remains open.</w:t>
+            </w:r>
+          </w:p>
+        </w:tc>
+        <w:tc>
+          <w:tcPr>
+            <w:tcW w:type="dxa" w:w="4320"/>
+            <w:vAlign w:val="center"/>
+            <w:tcMar>
+              <w:top w:w="75" w:type="dxa"/>
+              <w:bottom w:w="75" w:type="dxa"/>
+              <w:left w:w="85" w:type="dxa"/>
+              <w:right w:w="85" w:type="dxa"/>
+            </w:tcMar>
+            <w:shd w:fill="FFFFFF"/>
+          </w:tcPr>
+          <w:p>
+            <w:pPr>
+              <w:spacing w:after="40" w:before="40" w:line="254" w:lineRule="auto"/>
+            </w:pPr>
+            <w:r>
+              <w:rPr>
+                <w:b w:val="0"/>
+                <w:i w:val="0"/>
+                <w:color w:val="000000"/>
+                <w:sz w:val="22"/>
+              </w:rPr>
+              <w:t>Retain meaningful reviewer comments and resolutions, issue-to-requirement/test/commit links and accessible final artifacts. Reconcile the response register, PDFs and submission tag, then recheck changed artifacts.</w:t>
             </w:r>
           </w:p>
         </w:tc>
@@ -16490,12 +16909,238 @@
       </w:r>
     </w:p>
     <w:p>
+      <w:pPr>
+        <w:pStyle w:val="Heading2"/>
+      </w:pPr>
+      <w:r>
+        <w:t>11.3 Five deliverables for the next review</w:t>
+      </w:r>
+    </w:p>
+    <w:p>
       <w:r>
         <w:rPr>
           <w:b w:val="0"/>
           <w:i w:val="0"/>
         </w:rPr>
-        <w:t>When feedback arrives, record its date and source, the affected requirements, the agreed response and the resulting revision.</w:t>
+        <w:t>The next review date is unspecified. These deliverables remain open; the present documents provide inputs.</w:t>
+      </w:r>
+    </w:p>
+    <w:p>
+      <w:pPr>
+        <w:ind w:left="245" w:hanging="245"/>
+      </w:pPr>
+      <w:r>
+        <w:t xml:space="preserve">1. </w:t>
+      </w:r>
+      <w:r>
+        <w:rPr>
+          <w:b/>
+          <w:i w:val="0"/>
+        </w:rPr>
+        <w:t>Data and outcome feasibility decision:</w:t>
+      </w:r>
+      <w:r>
+        <w:rPr>
+          <w:b w:val="0"/>
+          <w:i w:val="0"/>
+        </w:rPr>
+        <w:t xml:space="preserve"> measurement specification, permitted temporal data, justified horizon or fallback. Aruzhan coordinates, with Saniya for measurement. </w:t>
+      </w:r>
+      <w:hyperlink r:id="rId131">
+        <w:r>
+          <w:rPr>
+            <w:color w:val="000000"/>
+            <w:u w:val="single"/>
+            <w:i/>
+            <w:rFonts w:ascii="Times New Roman" w:hAnsi="Times New Roman"/>
+          </w:rPr>
+          <w:t>ARP-16</w:t>
+        </w:r>
+      </w:hyperlink>
+      <w:r>
+        <w:rPr>
+          <w:b w:val="0"/>
+          <w:i w:val="0"/>
+        </w:rPr>
+        <w:t>.</w:t>
+      </w:r>
+    </w:p>
+    <w:p>
+      <w:pPr>
+        <w:ind w:left="245" w:hanging="245"/>
+      </w:pPr>
+      <w:r>
+        <w:t xml:space="preserve">2. </w:t>
+      </w:r>
+      <w:r>
+        <w:rPr>
+          <w:b/>
+          <w:i w:val="0"/>
+        </w:rPr>
+        <w:t>Interview findings and revised requirements:</w:t>
+      </w:r>
+      <w:r>
+        <w:rPr>
+          <w:b w:val="0"/>
+          <w:i w:val="0"/>
+        </w:rPr>
+        <w:t xml:space="preserve"> supported metadata, finding-to-change links and actual follow-up observations. Saniya coordinates, with Vitaliy for session evidence. </w:t>
+      </w:r>
+      <w:hyperlink r:id="rId124">
+        <w:r>
+          <w:rPr>
+            <w:color w:val="000000"/>
+            <w:u w:val="single"/>
+            <w:i/>
+            <w:rFonts w:ascii="Times New Roman" w:hAnsi="Times New Roman"/>
+          </w:rPr>
+          <w:t>ARP-11</w:t>
+        </w:r>
+      </w:hyperlink>
+      <w:r>
+        <w:rPr>
+          <w:b w:val="0"/>
+          <w:i w:val="0"/>
+        </w:rPr>
+        <w:t>.</w:t>
+      </w:r>
+    </w:p>
+    <w:p>
+      <w:pPr>
+        <w:ind w:left="245" w:hanging="245"/>
+      </w:pPr>
+      <w:r>
+        <w:t xml:space="preserve">3. </w:t>
+      </w:r>
+      <w:r>
+        <w:rPr>
+          <w:b/>
+          <w:i w:val="0"/>
+        </w:rPr>
+        <w:t>Working, tested application slice:</w:t>
+      </w:r>
+      <w:r>
+        <w:rPr>
+          <w:b w:val="0"/>
+          <w:i w:val="0"/>
+        </w:rPr>
+        <w:t xml:space="preserve"> authenticated input, validation, owned persistence, history and an executable API contract. Vitaliy coordinates. </w:t>
+      </w:r>
+      <w:hyperlink r:id="rId132">
+        <w:r>
+          <w:rPr>
+            <w:color w:val="000000"/>
+            <w:u w:val="single"/>
+            <w:i/>
+            <w:rFonts w:ascii="Times New Roman" w:hAnsi="Times New Roman"/>
+          </w:rPr>
+          <w:t>ARP-17</w:t>
+        </w:r>
+      </w:hyperlink>
+      <w:r>
+        <w:rPr>
+          <w:b w:val="0"/>
+          <w:i w:val="0"/>
+        </w:rPr>
+        <w:t>.</w:t>
+      </w:r>
+    </w:p>
+    <w:p>
+      <w:pPr>
+        <w:ind w:left="245" w:hanging="245"/>
+      </w:pPr>
+      <w:r>
+        <w:t xml:space="preserve">4. </w:t>
+      </w:r>
+      <w:r>
+        <w:rPr>
+          <w:b/>
+          <w:i w:val="0"/>
+        </w:rPr>
+        <w:t>Reproducible research/verification record:</w:t>
+      </w:r>
+      <w:r>
+        <w:rPr>
+          <w:b w:val="0"/>
+          <w:i w:val="0"/>
+        </w:rPr>
+        <w:t xml:space="preserve"> permitted-data audit, conditional protocol, configurations and actual expected/observed checks. Aruzhan coordinates research, Vitaliy software checks and Saniya UX. </w:t>
+      </w:r>
+      <w:hyperlink r:id="rId133">
+        <w:r>
+          <w:rPr>
+            <w:color w:val="000000"/>
+            <w:u w:val="single"/>
+            <w:i/>
+            <w:rFonts w:ascii="Times New Roman" w:hAnsi="Times New Roman"/>
+          </w:rPr>
+          <w:t>ARP-18</w:t>
+        </w:r>
+      </w:hyperlink>
+      <w:r>
+        <w:rPr>
+          <w:b w:val="0"/>
+          <w:i w:val="0"/>
+        </w:rPr>
+        <w:t>.</w:t>
+      </w:r>
+    </w:p>
+    <w:p>
+      <w:pPr>
+        <w:ind w:left="245" w:hanging="245"/>
+      </w:pPr>
+      <w:r>
+        <w:t xml:space="preserve">5. </w:t>
+      </w:r>
+      <w:r>
+        <w:rPr>
+          <w:b/>
+          <w:i w:val="0"/>
+        </w:rPr>
+        <w:t>GitHub/YouTrack evidence and comment responses:</w:t>
+      </w:r>
+      <w:r>
+        <w:rPr>
+          <w:b w:val="0"/>
+          <w:i w:val="0"/>
+        </w:rPr>
+        <w:t xml:space="preserve"> accessible reviewed revision, actual owners/states, substantive review records and traceable changes. Aruzhan consolidates evidence supplied by all members. </w:t>
+      </w:r>
+      <w:hyperlink r:id="rId126">
+        <w:r>
+          <w:rPr>
+            <w:color w:val="000000"/>
+            <w:u w:val="single"/>
+            <w:i/>
+            <w:rFonts w:ascii="Times New Roman" w:hAnsi="Times New Roman"/>
+          </w:rPr>
+          <w:t>ARP-13</w:t>
+        </w:r>
+      </w:hyperlink>
+      <w:r>
+        <w:rPr>
+          <w:b w:val="0"/>
+          <w:i w:val="0"/>
+        </w:rPr>
+        <w:t xml:space="preserve">, </w:t>
+      </w:r>
+      <w:hyperlink r:id="rId128">
+        <w:r>
+          <w:rPr>
+            <w:color w:val="000000"/>
+            <w:u w:val="single"/>
+            <w:i/>
+            <w:rFonts w:ascii="Times New Roman" w:hAnsi="Times New Roman"/>
+          </w:rPr>
+          <w:t>ARP-15</w:t>
+        </w:r>
+      </w:hyperlink>
+      <w:r>
+        <w:rPr>
+          <w:b w:val="0"/>
+          <w:i w:val="0"/>
+        </w:rPr>
+        <w:t>.</w:t>
       </w:r>
     </w:p>
     <w:sectPr>

</xml_diff>